<commit_message>
Update contact information and optimize document generation
Update contact email and optimize logo image for document generation.

Replit-Commit-Author: Agent
Replit-Commit-Session-Id: 1d0a5630-e7e3-4ae5-965a-9a019f4a94f0
Replit-Commit-Checkpoint-Type: full_checkpoint
Replit-Commit-Event-Id: 00d3b5ba-1fb5-4f5f-b538-9c97296e9c63
Replit-Commit-Screenshot-Url: https://storage.googleapis.com/screenshot-production-us-central1/02d0c056-728c-477d-8ff8-46fbb4dff163/1d0a5630-e7e3-4ae5-965a-9a019f4a94f0/QfGbEUh
Replit-Helium-Checkpoint-Created: true
</commit_message>
<xml_diff>
--- a/Documento_Entrega_Practiquemos.docx
+++ b/Documento_Entrega_Practiquemos.docx
@@ -23,7 +23,7 @@
               <a:graphicData uri="http://schemas.openxmlformats.org/drawingml/2006/picture">
                 <pic:pic>
                   <pic:nvPicPr>
-                    <pic:cNvPr id="0" name="Logo_sin_fondo_1773872982719.png"/>
+                    <pic:cNvPr id="0" name="logo_optimized.png"/>
                     <pic:cNvPicPr/>
                   </pic:nvPicPr>
                   <pic:blipFill>
@@ -4895,7 +4895,7 @@
               <a:graphicData uri="http://schemas.openxmlformats.org/drawingml/2006/picture">
                 <pic:pic>
                   <pic:nvPicPr>
-                    <pic:cNvPr id="0" name="Logo_sin_fondo_1773872982719.png"/>
+                    <pic:cNvPr id="0" name="logo_optimized.png"/>
                     <pic:cNvPicPr/>
                   </pic:nvPicPr>
                   <pic:blipFill>

</xml_diff>